<commit_message>
New "Naturaçı" Contract template added and some changes in another template
</commit_message>
<xml_diff>
--- a/wwwroot/Templates/İmtahan rəhbəri-müqavile.docx
+++ b/wwwroot/Templates/İmtahan rəhbəri-müqavile.docx
@@ -634,8 +634,6 @@
         </w:rPr>
         <w:t>___</w:t>
       </w:r>
-      <w:bookmarkStart w:id="0" w:name="_GoBack"/>
-      <w:bookmarkEnd w:id="0"/>
       <w:r>
         <w:rPr>
           <w:rFonts w:ascii="Arial" w:hAnsi="Arial" w:cs="Arial"/>
@@ -4392,8 +4390,6 @@
     </w:p>
     <w:p>
       <w:pPr>
-        <w:ind w:left="360"/>
-        <w:jc w:val="center"/>
         <w:rPr>
           <w:rFonts w:ascii="Arial" w:hAnsi="Arial" w:cs="Arial"/>
           <w:b/>
@@ -4402,69 +4398,8 @@
           <w:lang w:val="az-Latn-AZ"/>
         </w:rPr>
       </w:pPr>
-    </w:p>
-    <w:p>
-      <w:pPr>
-        <w:ind w:left="360"/>
-        <w:jc w:val="center"/>
-        <w:rPr>
-          <w:rFonts w:ascii="Arial" w:hAnsi="Arial" w:cs="Arial"/>
-          <w:b/>
-          <w:sz w:val="23"/>
-          <w:szCs w:val="23"/>
-          <w:lang w:val="az-Latn-AZ"/>
-        </w:rPr>
-      </w:pPr>
-    </w:p>
-    <w:p>
-      <w:pPr>
-        <w:ind w:left="360"/>
-        <w:jc w:val="center"/>
-        <w:rPr>
-          <w:rFonts w:ascii="Arial" w:hAnsi="Arial" w:cs="Arial"/>
-          <w:b/>
-          <w:sz w:val="23"/>
-          <w:szCs w:val="23"/>
-          <w:lang w:val="az-Latn-AZ"/>
-        </w:rPr>
-      </w:pPr>
-    </w:p>
-    <w:p>
-      <w:pPr>
-        <w:ind w:left="360"/>
-        <w:jc w:val="center"/>
-        <w:rPr>
-          <w:rFonts w:ascii="Arial" w:hAnsi="Arial" w:cs="Arial"/>
-          <w:b/>
-          <w:sz w:val="23"/>
-          <w:szCs w:val="23"/>
-          <w:lang w:val="az-Latn-AZ"/>
-        </w:rPr>
-      </w:pPr>
-    </w:p>
-    <w:p>
-      <w:pPr>
-        <w:ind w:left="360"/>
-        <w:jc w:val="center"/>
-        <w:rPr>
-          <w:rFonts w:ascii="Arial" w:hAnsi="Arial" w:cs="Arial"/>
-          <w:b/>
-          <w:sz w:val="23"/>
-          <w:szCs w:val="23"/>
-          <w:lang w:val="az-Latn-AZ"/>
-        </w:rPr>
-      </w:pPr>
-    </w:p>
-    <w:p>
-      <w:pPr>
-        <w:rPr>
-          <w:rFonts w:ascii="Arial" w:hAnsi="Arial" w:cs="Arial"/>
-          <w:b/>
-          <w:sz w:val="23"/>
-          <w:szCs w:val="23"/>
-          <w:lang w:val="az-Latn-AZ"/>
-        </w:rPr>
-      </w:pPr>
+      <w:bookmarkStart w:id="0" w:name="_GoBack"/>
+      <w:bookmarkEnd w:id="0"/>
     </w:p>
     <w:sectPr>
       <w:pgSz w:w="11906" w:h="16838"/>

</xml_diff>